<commit_message>
Documento teórico v2: área do IBGE conferida e paginação corrigida (29-10-2026)
- Área territorial de São Caetano do Sul conforme o IBGE Cidades (15,4 km²)
- Página em branco removida depois da lista de tabelas; quebras manuais
  trocadas por "quebra de página antes" nos títulos; sumário e listas
  com os números de página acertados
- CRONOGRAMA_STATUS.md e CLAUDE.md com a pendência do IBGE resolvida

Co-Authored-By: Claude Opus 5.5 <noreply@anthropic.com>
</commit_message>
<xml_diff>
--- a/docs/Documento Teórico/TCC_Alagamentos_Versao2_2026-10-29.docx
+++ b/docs/Documento Teórico/TCC_Alagamentos_Versao2_2026-10-29.docx
@@ -171,13 +171,11 @@
         </w:rPr>
         <w:t>2026</w:t>
       </w:r>
-      <w:r>
-        <w:br w:type="page"/>
-      </w:r>
     </w:p>
     <w:p>
       <w:pPr>
         <w:pStyle w:val="Normal"/>
+        <w:pageBreakBefore/>
         <w:spacing w:lineRule="auto" w:line="360" w:before="0" w:after="0"/>
         <w:jc w:val="center"/>
         <w:rPr/>
@@ -332,13 +330,11 @@
         </w:rPr>
         <w:t>2026</w:t>
       </w:r>
-      <w:r>
-        <w:br w:type="page"/>
-      </w:r>
     </w:p>
     <w:p>
       <w:pPr>
         <w:pStyle w:val="Normal"/>
+        <w:pageBreakBefore/>
         <w:spacing w:lineRule="auto" w:line="360" w:before="0" w:after="0"/>
         <w:jc w:val="center"/>
         <w:rPr/>
@@ -797,13 +793,11 @@
         </w:rPr>
         <w:t>Prof. Me. Fabrício Perrella</w:t>
       </w:r>
-      <w:r>
-        <w:br w:type="page"/>
-      </w:r>
     </w:p>
     <w:p>
       <w:pPr>
         <w:pStyle w:val="Normal"/>
+        <w:pageBreakBefore/>
         <w:spacing w:lineRule="auto" w:line="360" w:before="0" w:after="0"/>
         <w:jc w:val="center"/>
         <w:rPr/>
@@ -933,13 +927,11 @@
         </w:rPr>
         <w:t xml:space="preserve"> de 2026</w:t>
       </w:r>
-      <w:r>
-        <w:br w:type="page"/>
-      </w:r>
     </w:p>
     <w:p>
       <w:pPr>
         <w:pStyle w:val="Titulosemnumero"/>
+        <w:pageBreakBefore/>
         <w:rPr/>
       </w:pPr>
       <w:r>
@@ -982,13 +974,11 @@
         <w:rPr/>
         <w:t>Às pessoas que responderam ao formulário de avaliação do aplicativo, pelo tempo e pelas sugestões, que se tornaram melhorias no aplicativo.</w:t>
       </w:r>
-      <w:r>
-        <w:br w:type="page"/>
-      </w:r>
     </w:p>
     <w:p>
       <w:pPr>
         <w:pStyle w:val="Titulosemnumero"/>
+        <w:pageBreakBefore/>
         <w:rPr/>
       </w:pPr>
       <w:r>
@@ -1025,13 +1015,11 @@
         <w:rPr/>
         <w:t xml:space="preserve"> Alagamentos urbanos. Dados colaborativos. Fusão de dados. PostGIS. Processo de Análise Hierárquica.</w:t>
       </w:r>
-      <w:r>
-        <w:br w:type="page"/>
-      </w:r>
     </w:p>
     <w:p>
       <w:pPr>
         <w:pStyle w:val="Titulosemnumero"/>
+        <w:pageBreakBefore/>
         <w:rPr/>
       </w:pPr>
       <w:r>
@@ -1068,13 +1056,11 @@
         <w:rPr/>
         <w:t xml:space="preserve"> Urban flooding. Crowdsourced data. Data fusion. PostGIS. Analytic Hierarchy Process.</w:t>
       </w:r>
-      <w:r>
-        <w:br w:type="page"/>
-      </w:r>
     </w:p>
     <w:p>
       <w:pPr>
         <w:pStyle w:val="Titulosemnumero"/>
+        <w:pageBreakBefore/>
         <w:rPr/>
       </w:pPr>
       <w:r>
@@ -1107,7 +1093,7 @@
           <w:rPr/>
           <w:t>Figura 1 – Cronograma executado do TCC II (diagrama de Gantt)</w:t>
           <w:tab/>
-          <w:t>34</w:t>
+          <w:t>33</w:t>
         </w:r>
       </w:hyperlink>
     </w:p>
@@ -1125,7 +1111,7 @@
           <w:rPr/>
           <w:t>Figura 2 – Arquitetura do sistema</w:t>
           <w:tab/>
-          <w:t>35</w:t>
+          <w:t>34</w:t>
         </w:r>
       </w:hyperlink>
     </w:p>
@@ -1143,7 +1129,7 @@
           <w:rPr/>
           <w:t>Figura 3 – Etapas do cálculo de risco e caminhos de falha</w:t>
           <w:tab/>
-          <w:t>37</w:t>
+          <w:t>36</w:t>
         </w:r>
       </w:hyperlink>
     </w:p>
@@ -1161,7 +1147,7 @@
           <w:rPr/>
           <w:t>Figura 4 – Diagrama entidade-relacionamento do banco de dados</w:t>
           <w:tab/>
-          <w:t>38</w:t>
+          <w:t>37</w:t>
         </w:r>
       </w:hyperlink>
     </w:p>
@@ -1179,7 +1165,7 @@
           <w:rPr/>
           <w:t>Figura 5 – Entrada (a), aba Mapa (b) e ocorrência selecionada no mapa (c)</w:t>
           <w:tab/>
-          <w:t>44</w:t>
+          <w:t>43</w:t>
         </w:r>
       </w:hyperlink>
     </w:p>
@@ -1197,7 +1183,7 @@
           <w:rPr/>
           <w:t>Figura 6 – Aba Alertas (a), lista filtrada (b) e detalhes de uma ocorrência (c)</w:t>
           <w:tab/>
-          <w:t>45</w:t>
+          <w:t>44</w:t>
         </w:r>
       </w:hyperlink>
     </w:p>
@@ -1215,7 +1201,7 @@
           <w:rPr/>
           <w:t>Figura 7 – Cadastro de ocorrência (a), aba Previsão (b) e origem da chuva atual (c)</w:t>
           <w:tab/>
-          <w:t>46</w:t>
+          <w:t>45</w:t>
         </w:r>
       </w:hyperlink>
     </w:p>
@@ -1233,7 +1219,7 @@
           <w:rPr/>
           <w:t>Figura 8 – Aba Ajustes (a) e perfil do usuário (b)</w:t>
           <w:tab/>
-          <w:t>47</w:t>
+          <w:t>46</w:t>
         </w:r>
       </w:hyperlink>
     </w:p>
@@ -1251,7 +1237,7 @@
           <w:rPr/>
           <w:t>Figura 9 – Tempo da consulta espacial com e sem índice GiST</w:t>
           <w:tab/>
-          <w:t>53</w:t>
+          <w:t>52</w:t>
         </w:r>
       </w:hyperlink>
     </w:p>
@@ -1269,7 +1255,7 @@
           <w:rPr/>
           <w:t>Figura 10 – Tempo da consulta do endpoint com e sem índice GiST</w:t>
           <w:tab/>
-          <w:t>54</w:t>
+          <w:t>53</w:t>
         </w:r>
       </w:hyperlink>
       <w:r>
@@ -1279,19 +1265,8 @@
     </w:p>
     <w:p>
       <w:pPr>
-        <w:pStyle w:val="Normal"/>
-        <w:rPr/>
-      </w:pPr>
-      <w:r>
-        <w:rPr/>
-      </w:r>
-      <w:r>
-        <w:br w:type="page"/>
-      </w:r>
-    </w:p>
-    <w:p>
-      <w:pPr>
         <w:pStyle w:val="Titulosemnumero"/>
+        <w:pageBreakBefore/>
         <w:rPr/>
       </w:pPr>
       <w:r>
@@ -1324,7 +1299,7 @@
           <w:rPr/>
           <w:t>Tabela 1 – Comparação com soluções correlatas</w:t>
           <w:tab/>
-          <w:t>27</w:t>
+          <w:t>26</w:t>
         </w:r>
       </w:hyperlink>
     </w:p>
@@ -1342,7 +1317,7 @@
           <w:rPr/>
           <w:t>Tabela 2 – Etapas da Design Science Research no trabalho</w:t>
           <w:tab/>
-          <w:t>28</w:t>
+          <w:t>27</w:t>
         </w:r>
       </w:hyperlink>
     </w:p>
@@ -1360,7 +1335,7 @@
           <w:rPr/>
           <w:t>Tabela 3 – Fontes de dados avaliadas e situação final</w:t>
           <w:tab/>
-          <w:t>29</w:t>
+          <w:t>28</w:t>
         </w:r>
       </w:hyperlink>
     </w:p>
@@ -1378,7 +1353,7 @@
           <w:rPr/>
           <w:t>Tabela 4 – Requisitos funcionais, critérios de aceitação e casos de teste</w:t>
           <w:tab/>
-          <w:t>32</w:t>
+          <w:t>31</w:t>
         </w:r>
       </w:hyperlink>
     </w:p>
@@ -1396,7 +1371,7 @@
           <w:rPr/>
           <w:t>Tabela 5 – Requisitos não funcionais</w:t>
           <w:tab/>
-          <w:t>33</w:t>
+          <w:t>32</w:t>
         </w:r>
       </w:hyperlink>
     </w:p>
@@ -1414,7 +1389,7 @@
           <w:rPr/>
           <w:t>Tabela 6 – Papéis e responsabilidades da equipe</w:t>
           <w:tab/>
-          <w:t>34</w:t>
+          <w:t>33</w:t>
         </w:r>
       </w:hyperlink>
     </w:p>
@@ -1432,7 +1407,7 @@
           <w:rPr/>
           <w:t>Tabela 7 – Operações da API</w:t>
           <w:tab/>
-          <w:t>35</w:t>
+          <w:t>34</w:t>
         </w:r>
       </w:hyperlink>
     </w:p>
@@ -1450,7 +1425,7 @@
           <w:rPr/>
           <w:t>Tabela 8 – Decisões de arquitetura e justificativas</w:t>
           <w:tab/>
-          <w:t>37</w:t>
+          <w:t>36</w:t>
         </w:r>
       </w:hyperlink>
     </w:p>
@@ -1468,7 +1443,7 @@
           <w:rPr/>
           <w:t>Tabela 9 – Matriz de comparação pareada dos critérios</w:t>
           <w:tab/>
-          <w:t>40</w:t>
+          <w:t>39</w:t>
         </w:r>
       </w:hyperlink>
     </w:p>
@@ -1486,7 +1461,7 @@
           <w:rPr/>
           <w:t>Tabela 10 – Conversão da intensidade de chuva em pontuação</w:t>
           <w:tab/>
-          <w:t>41</w:t>
+          <w:t>40</w:t>
         </w:r>
       </w:hyperlink>
     </w:p>
@@ -1504,7 +1479,7 @@
           <w:rPr/>
           <w:t>Tabela 11 – Piso da classificação pelos avisos do INMET</w:t>
           <w:tab/>
-          <w:t>42</w:t>
+          <w:t>41</w:t>
         </w:r>
       </w:hyperlink>
     </w:p>
@@ -1522,7 +1497,7 @@
           <w:rPr/>
           <w:t>Tabela 12 – Tecnologias do aplicativo Android</w:t>
           <w:tab/>
-          <w:t>43</w:t>
+          <w:t>42</w:t>
         </w:r>
       </w:hyperlink>
     </w:p>
@@ -1540,7 +1515,7 @@
           <w:rPr/>
           <w:t>Tabela 13 – Frentes de avaliação</w:t>
           <w:tab/>
-          <w:t>49</w:t>
+          <w:t>48</w:t>
         </w:r>
       </w:hyperlink>
     </w:p>
@@ -1558,7 +1533,7 @@
           <w:rPr/>
           <w:t>Tabela 14 – Casos de teste por módulo e situação em 29/10/2026</w:t>
           <w:tab/>
-          <w:t>50</w:t>
+          <w:t>49</w:t>
         </w:r>
       </w:hyperlink>
     </w:p>
@@ -1576,7 +1551,7 @@
           <w:rPr/>
           <w:t>Tabela 15 – Defeitos encontrados nos testes</w:t>
           <w:tab/>
-          <w:t>51</w:t>
+          <w:t>50</w:t>
         </w:r>
       </w:hyperlink>
     </w:p>
@@ -1594,7 +1569,7 @@
           <w:rPr/>
           <w:t>Tabela 16 – Consulta espacial: tempo de execução (mediana, ms)</w:t>
           <w:tab/>
-          <w:t>52</w:t>
+          <w:t>51</w:t>
         </w:r>
       </w:hyperlink>
     </w:p>
@@ -1612,7 +1587,7 @@
           <w:rPr/>
           <w:t>Tabela 17 – Consulta do endpoint: tempo de execução (mediana, ms)</w:t>
           <w:tab/>
-          <w:t>54</w:t>
+          <w:t>53</w:t>
         </w:r>
       </w:hyperlink>
     </w:p>
@@ -1630,7 +1605,7 @@
           <w:rPr/>
           <w:t>Tabela 18 – Latência das leituras e do cadastro com nível informado, no banco de demonstração (demo) e no de 1 milhão de registros (ms)</w:t>
           <w:tab/>
-          <w:t>55</w:t>
+          <w:t>54</w:t>
         </w:r>
       </w:hyperlink>
     </w:p>
@@ -1648,7 +1623,7 @@
           <w:rPr/>
           <w:t>Tabela 19 – Latência do cadastro com risco automático (ms)</w:t>
           <w:tab/>
-          <w:t>55</w:t>
+          <w:t>54</w:t>
         </w:r>
       </w:hyperlink>
     </w:p>
@@ -1666,7 +1641,7 @@
           <w:rPr/>
           <w:t>Tabela 20 – Atendimento dos requisitos de desempenho</w:t>
           <w:tab/>
-          <w:t>56</w:t>
+          <w:t>55</w:t>
         </w:r>
       </w:hyperlink>
     </w:p>
@@ -1684,7 +1659,7 @@
           <w:rPr/>
           <w:t>Tabela 21 – Notas médias por tela e critério (12 participantes, escala de 1 a 5)</w:t>
           <w:tab/>
-          <w:t>56</w:t>
+          <w:t>55</w:t>
         </w:r>
       </w:hyperlink>
     </w:p>
@@ -1702,7 +1677,7 @@
           <w:rPr/>
           <w:t>Tabela 22 – Perguntas específicas, respostas e melhorias aplicadas</w:t>
           <w:tab/>
-          <w:t>57</w:t>
+          <w:t>56</w:t>
         </w:r>
       </w:hyperlink>
     </w:p>
@@ -1720,7 +1695,7 @@
           <w:rPr/>
           <w:t>Tabela 23 – Objetivos específicos e resultados</w:t>
           <w:tab/>
-          <w:t>60</w:t>
+          <w:t>59</w:t>
         </w:r>
       </w:hyperlink>
     </w:p>
@@ -1748,19 +1723,8 @@
     </w:p>
     <w:p>
       <w:pPr>
-        <w:pStyle w:val="Normal"/>
-        <w:rPr/>
-      </w:pPr>
-      <w:r>
-        <w:rPr/>
-      </w:r>
-      <w:r>
-        <w:br w:type="page"/>
-      </w:r>
-    </w:p>
-    <w:p>
-      <w:pPr>
         <w:pStyle w:val="Titulosemnumero"/>
+        <w:pageBreakBefore/>
         <w:rPr/>
       </w:pPr>
       <w:r>
@@ -3068,7 +3032,7 @@
               </w:rPr>
               <w:t>1 Introdução</w:t>
               <w:tab/>
-              <w:t>17</w:t>
+              <w:t>16</w:t>
             </w:r>
           </w:hyperlink>
         </w:p>
@@ -3088,7 +3052,7 @@
               </w:rPr>
               <w:t>1.1 Objetivos</w:t>
               <w:tab/>
-              <w:t>18</w:t>
+              <w:t>17</w:t>
             </w:r>
           </w:hyperlink>
         </w:p>
@@ -3108,7 +3072,7 @@
               </w:rPr>
               <w:t>1.1.1 Objetivo geral</w:t>
               <w:tab/>
-              <w:t>18</w:t>
+              <w:t>17</w:t>
             </w:r>
           </w:hyperlink>
         </w:p>
@@ -3128,7 +3092,7 @@
               </w:rPr>
               <w:t>1.1.2 Objetivos específicos</w:t>
               <w:tab/>
-              <w:t>18</w:t>
+              <w:t>17</w:t>
             </w:r>
           </w:hyperlink>
         </w:p>
@@ -3148,7 +3112,7 @@
               </w:rPr>
               <w:t>1.2 Justificativa</w:t>
               <w:tab/>
-              <w:t>19</w:t>
+              <w:t>18</w:t>
             </w:r>
           </w:hyperlink>
         </w:p>
@@ -3168,7 +3132,7 @@
               </w:rPr>
               <w:t>1.3 Delimitação do estudo</w:t>
               <w:tab/>
-              <w:t>20</w:t>
+              <w:t>19</w:t>
             </w:r>
           </w:hyperlink>
         </w:p>
@@ -3188,7 +3152,7 @@
               </w:rPr>
               <w:t>2 Referencial Teórico</w:t>
               <w:tab/>
-              <w:t>22</w:t>
+              <w:t>21</w:t>
             </w:r>
           </w:hyperlink>
         </w:p>
@@ -3208,7 +3172,7 @@
               </w:rPr>
               <w:t>2.1 Alagamentos urbanos e sistemas de monitoramento</w:t>
               <w:tab/>
-              <w:t>22</w:t>
+              <w:t>21</w:t>
             </w:r>
           </w:hyperlink>
         </w:p>
@@ -3228,7 +3192,7 @@
               </w:rPr>
               <w:t>2.2 Dados colaborativos e qualidade</w:t>
               <w:tab/>
-              <w:t>22</w:t>
+              <w:t>21</w:t>
             </w:r>
           </w:hyperlink>
         </w:p>
@@ -3248,7 +3212,7 @@
               </w:rPr>
               <w:t>2.3 Georreferenciamento e bancos de dados geoespaciais</w:t>
               <w:tab/>
-              <w:t>23</w:t>
+              <w:t>22</w:t>
             </w:r>
           </w:hyperlink>
         </w:p>
@@ -3268,7 +3232,7 @@
               </w:rPr>
               <w:t>2.4 Indexação espacial: R-tree e GiST</w:t>
               <w:tab/>
-              <w:t>23</w:t>
+              <w:t>22</w:t>
             </w:r>
           </w:hyperlink>
         </w:p>
@@ -3288,7 +3252,7 @@
               </w:rPr>
               <w:t>2.5 Integração de sistemas e fusão de dados</w:t>
               <w:tab/>
-              <w:t>24</w:t>
+              <w:t>23</w:t>
             </w:r>
           </w:hyperlink>
         </w:p>
@@ -3308,7 +3272,7 @@
               </w:rPr>
               <w:t>2.6 Método AHP</w:t>
               <w:tab/>
-              <w:t>24</w:t>
+              <w:t>23</w:t>
             </w:r>
           </w:hyperlink>
         </w:p>
@@ -3328,7 +3292,7 @@
               </w:rPr>
               <w:t>2.7 Intensidade de chuva</w:t>
               <w:tab/>
-              <w:t>25</w:t>
+              <w:t>24</w:t>
             </w:r>
           </w:hyperlink>
         </w:p>
@@ -3348,7 +3312,7 @@
               </w:rPr>
               <w:t>2.8 Tempo de resposta e qualidade de software</w:t>
               <w:tab/>
-              <w:t>25</w:t>
+              <w:t>24</w:t>
             </w:r>
           </w:hyperlink>
         </w:p>
@@ -3368,7 +3332,7 @@
               </w:rPr>
               <w:t>2.9 Desenvolvimento Android com Kotlin e XML</w:t>
               <w:tab/>
-              <w:t>26</w:t>
+              <w:t>25</w:t>
             </w:r>
           </w:hyperlink>
         </w:p>
@@ -3388,7 +3352,7 @@
               </w:rPr>
               <w:t>2.10 Privacidade e proteção de dados</w:t>
               <w:tab/>
-              <w:t>26</w:t>
+              <w:t>25</w:t>
             </w:r>
           </w:hyperlink>
         </w:p>
@@ -3408,7 +3372,7 @@
               </w:rPr>
               <w:t>2.11 Trabalhos e soluções correlatas</w:t>
               <w:tab/>
-              <w:t>26</w:t>
+              <w:t>25</w:t>
             </w:r>
           </w:hyperlink>
         </w:p>
@@ -3428,7 +3392,7 @@
               </w:rPr>
               <w:t>3 Pesquisa/Amostragem</w:t>
               <w:tab/>
-              <w:t>28</w:t>
+              <w:t>27</w:t>
             </w:r>
           </w:hyperlink>
         </w:p>
@@ -3448,7 +3412,7 @@
               </w:rPr>
               <w:t>3.1 Caracterização da pesquisa</w:t>
               <w:tab/>
-              <w:t>28</w:t>
+              <w:t>27</w:t>
             </w:r>
           </w:hyperlink>
         </w:p>
@@ -3468,7 +3432,7 @@
               </w:rPr>
               <w:t>3.2 Área de estudo e unidade de análise</w:t>
               <w:tab/>
-              <w:t>28</w:t>
+              <w:t>27</w:t>
             </w:r>
           </w:hyperlink>
         </w:p>
@@ -3488,7 +3452,7 @@
               </w:rPr>
               <w:t>3.3 Fontes de dados</w:t>
               <w:tab/>
-              <w:t>29</w:t>
+              <w:t>28</w:t>
             </w:r>
           </w:hyperlink>
         </w:p>
@@ -3508,7 +3472,7 @@
               </w:rPr>
               <w:t>3.4 Amostragem e dados utilizados</w:t>
               <w:tab/>
-              <w:t>29</w:t>
+              <w:t>28</w:t>
             </w:r>
           </w:hyperlink>
         </w:p>
@@ -3528,7 +3492,7 @@
               </w:rPr>
               <w:t>3.5 Procedimentos de avaliação</w:t>
               <w:tab/>
-              <w:t>30</w:t>
+              <w:t>29</w:t>
             </w:r>
           </w:hyperlink>
         </w:p>
@@ -3548,7 +3512,7 @@
               </w:rPr>
               <w:t>3.6 Aspectos éticos</w:t>
               <w:tab/>
-              <w:t>31</w:t>
+              <w:t>30</w:t>
             </w:r>
           </w:hyperlink>
         </w:p>
@@ -3568,7 +3532,7 @@
               </w:rPr>
               <w:t>4 Desenvolvimento</w:t>
               <w:tab/>
-              <w:t>32</w:t>
+              <w:t>31</w:t>
             </w:r>
           </w:hyperlink>
         </w:p>
@@ -3588,7 +3552,7 @@
               </w:rPr>
               <w:t>4.1 Requisitos do Sistema</w:t>
               <w:tab/>
-              <w:t>32</w:t>
+              <w:t>31</w:t>
             </w:r>
           </w:hyperlink>
         </w:p>
@@ -3608,7 +3572,7 @@
               </w:rPr>
               <w:t>4.2 Cronograma de Projeto</w:t>
               <w:tab/>
-              <w:t>33</w:t>
+              <w:t>32</w:t>
             </w:r>
           </w:hyperlink>
         </w:p>
@@ -3628,7 +3592,7 @@
               </w:rPr>
               <w:t>4.3 Desenho da Arquitetura do Software</w:t>
               <w:tab/>
-              <w:t>34</w:t>
+              <w:t>33</w:t>
             </w:r>
           </w:hyperlink>
         </w:p>
@@ -3648,7 +3612,7 @@
               </w:rPr>
               <w:t>4.3.1 Fluxo do cadastro com risco automático</w:t>
               <w:tab/>
-              <w:t>36</w:t>
+              <w:t>35</w:t>
             </w:r>
           </w:hyperlink>
         </w:p>
@@ -3668,7 +3632,7 @@
               </w:rPr>
               <w:t>4.3.2 Implantação</w:t>
               <w:tab/>
-              <w:t>37</w:t>
+              <w:t>36</w:t>
             </w:r>
           </w:hyperlink>
         </w:p>
@@ -3688,7 +3652,7 @@
               </w:rPr>
               <w:t>4.4 Desenho do Projeto de Banco de Dados</w:t>
               <w:tab/>
-              <w:t>38</w:t>
+              <w:t>37</w:t>
             </w:r>
           </w:hyperlink>
         </w:p>
@@ -3708,7 +3672,7 @@
               </w:rPr>
               <w:t>4.5 Implementação</w:t>
               <w:tab/>
-              <w:t>39</w:t>
+              <w:t>38</w:t>
             </w:r>
           </w:hyperlink>
         </w:p>
@@ -3728,7 +3692,7 @@
               </w:rPr>
               <w:t>4.5.1 Integração das fontes e regra de fusão</w:t>
               <w:tab/>
-              <w:t>39</w:t>
+              <w:t>38</w:t>
             </w:r>
           </w:hyperlink>
         </w:p>
@@ -3748,7 +3712,7 @@
               </w:rPr>
               <w:t>4.5.2 Índice de Risco de Alagamento (modelo AHP)</w:t>
               <w:tab/>
-              <w:t>40</w:t>
+              <w:t>39</w:t>
             </w:r>
           </w:hyperlink>
         </w:p>
@@ -3768,7 +3732,7 @@
               </w:rPr>
               <w:t>4.5.3 Aplicativo Android</w:t>
               <w:tab/>
-              <w:t>43</w:t>
+              <w:t>42</w:t>
             </w:r>
           </w:hyperlink>
         </w:p>
@@ -3788,7 +3752,7 @@
               </w:rPr>
               <w:t>4.5.4 Repositório e qualidade do código</w:t>
               <w:tab/>
-              <w:t>47</w:t>
+              <w:t>46</w:t>
             </w:r>
           </w:hyperlink>
         </w:p>
@@ -3808,7 +3772,7 @@
               </w:rPr>
               <w:t>5 Testes</w:t>
               <w:tab/>
-              <w:t>49</w:t>
+              <w:t>48</w:t>
             </w:r>
           </w:hyperlink>
         </w:p>
@@ -3828,7 +3792,7 @@
               </w:rPr>
               <w:t>5.1 Planos de Testes</w:t>
               <w:tab/>
-              <w:t>49</w:t>
+              <w:t>48</w:t>
             </w:r>
           </w:hyperlink>
         </w:p>
@@ -3848,7 +3812,7 @@
               </w:rPr>
               <w:t>5.2 Cenários de Testes</w:t>
               <w:tab/>
-              <w:t>50</w:t>
+              <w:t>49</w:t>
             </w:r>
           </w:hyperlink>
         </w:p>
@@ -3868,7 +3832,7 @@
               </w:rPr>
               <w:t>5.3 Resultados</w:t>
               <w:tab/>
-              <w:t>51</w:t>
+              <w:t>50</w:t>
             </w:r>
           </w:hyperlink>
         </w:p>
@@ -3888,7 +3852,7 @@
               </w:rPr>
               <w:t>5.3.1 Testes automatizados e funcionais</w:t>
               <w:tab/>
-              <w:t>51</w:t>
+              <w:t>50</w:t>
             </w:r>
           </w:hyperlink>
         </w:p>
@@ -3908,7 +3872,7 @@
               </w:rPr>
               <w:t>5.3.2 Análise de sensibilidade do índice</w:t>
               <w:tab/>
-              <w:t>52</w:t>
+              <w:t>51</w:t>
             </w:r>
           </w:hyperlink>
         </w:p>
@@ -3928,7 +3892,7 @@
               </w:rPr>
               <w:t>5.3.3 Benchmark de indexação espacial</w:t>
               <w:tab/>
-              <w:t>52</w:t>
+              <w:t>51</w:t>
             </w:r>
           </w:hyperlink>
         </w:p>
@@ -3948,7 +3912,7 @@
               </w:rPr>
               <w:t>5.3.4 Latência da API</w:t>
               <w:tab/>
-              <w:t>55</w:t>
+              <w:t>54</w:t>
             </w:r>
           </w:hyperlink>
         </w:p>
@@ -3968,7 +3932,7 @@
               </w:rPr>
               <w:t>5.3.5 Usabilidade</w:t>
               <w:tab/>
-              <w:t>56</w:t>
+              <w:t>55</w:t>
             </w:r>
           </w:hyperlink>
         </w:p>
@@ -3988,7 +3952,7 @@
               </w:rPr>
               <w:t>6 Conclusão</w:t>
               <w:tab/>
-              <w:t>59</w:t>
+              <w:t>58</w:t>
             </w:r>
           </w:hyperlink>
         </w:p>
@@ -4008,7 +3972,7 @@
               </w:rPr>
               <w:t>6.1 Objetivos atingidos</w:t>
               <w:tab/>
-              <w:t>59</w:t>
+              <w:t>58</w:t>
             </w:r>
           </w:hyperlink>
         </w:p>
@@ -4028,7 +3992,7 @@
               </w:rPr>
               <w:t>6.2 Limitações</w:t>
               <w:tab/>
-              <w:t>60</w:t>
+              <w:t>59</w:t>
             </w:r>
           </w:hyperlink>
         </w:p>
@@ -4048,7 +4012,7 @@
               </w:rPr>
               <w:t>6.3 Trabalhos futuros</w:t>
               <w:tab/>
-              <w:t>61</w:t>
+              <w:t>60</w:t>
             </w:r>
           </w:hyperlink>
         </w:p>
@@ -4577,7 +4541,7 @@
       </w:r>
       <w:r>
         <w:rPr/>
-        <w:t xml:space="preserve"> O estudo foi delimitado ao município de São Caetano do Sul, no ABC Paulista, com 15,3 km² e 165.655 habitantes no Censo 2022 (IBGE, 2026). A escolha, feita pelo grupo em 03/09/2026, considerou a área compacta e densamente urbanizada, a proximidade com a universidade e a possibilidade de cobrir o município inteiro com um único código de previsão do INMET. O aplicativo e a API aceitam apenas ocorrências dentro do município; a API recusa coordenadas fora de um retângulo aproximado de seus limites.</w:t>
+        <w:t xml:space="preserve"> O estudo foi delimitado ao município de São Caetano do Sul, no ABC Paulista, com 15,4 km² de área territorial e 165.655 habitantes no Censo 2022 (IBGE, 2026). A escolha, feita pelo grupo em 03/09/2026, considerou a área compacta e densamente urbanizada, a proximidade com a universidade e a possibilidade de cobrir o município inteiro com um único código de previsão do INMET. O aplicativo e a API aceitam apenas ocorrências dentro do município; a API recusa coordenadas fora de um retângulo aproximado de seus limites.</w:t>
       </w:r>
     </w:p>
     <w:p>
@@ -4743,13 +4707,11 @@
         <w:rPr/>
         <w:t xml:space="preserve"> A geolocalização foi tratada como dado pessoal (ANPD, 2026). O sistema guarda apenas o ponto da ocorrência, sem trajetórias; o perfil do usuário fica só no aparelho, e o servidor recebe apenas um identificador gerado pelo próprio aplicativo.</w:t>
       </w:r>
-      <w:r>
-        <w:br w:type="page"/>
-      </w:r>
     </w:p>
     <w:p>
       <w:pPr>
         <w:pStyle w:val="Heading1"/>
+        <w:pageBreakBefore/>
         <w:rPr/>
       </w:pPr>
       <w:bookmarkStart w:id="12" w:name="__RefHeading___Toc3619_984269736"/>
@@ -6086,13 +6048,11 @@
         <w:rPr/>
         <w:t>Fonte: elaborada pelos autores (2026).</w:t>
       </w:r>
-      <w:r>
-        <w:br w:type="page"/>
-      </w:r>
     </w:p>
     <w:p>
       <w:pPr>
         <w:pStyle w:val="Heading1"/>
+        <w:pageBreakBefore/>
         <w:rPr/>
       </w:pPr>
       <w:bookmarkStart w:id="36" w:name="__RefHeading___Toc3643_984269736"/>
@@ -7893,13 +7853,11 @@
         <w:rPr/>
         <w:t>O formulário apresentava um Termo de Consentimento Livre e Esclarecido informando que a participação é voluntária e anônima e que as ocorrências exibidas são de demonstração, e só foram analisadas as respostas de quem declarou concordar com ele. O formulário não coleta nome, e-mail nem outro dado que identifique o participante. O sistema também não coleta dados pessoais além do necessário (Seção 2.10).</w:t>
       </w:r>
-      <w:r>
-        <w:br w:type="page"/>
-      </w:r>
     </w:p>
     <w:p>
       <w:pPr>
         <w:pStyle w:val="Heading1"/>
+        <w:pageBreakBefore/>
         <w:rPr/>
       </w:pPr>
       <w:bookmarkStart w:id="50" w:name="__RefHeading___Toc3657_984269736"/>
@@ -15857,13 +15815,11 @@
         <w:rPr/>
         <w:t xml:space="preserve"> (documentação técnica, plano de testes, evidências e capturas). A cada envio ao repositório, um fluxo de integração contínua (GitHub Actions) executa a suíte do backend contra um PostgreSQL/PostGIS real e compila e testa o aplicativo; as chaves e senhas ficam fora do repositório.</w:t>
       </w:r>
-      <w:r>
-        <w:br w:type="page"/>
-      </w:r>
     </w:p>
     <w:p>
       <w:pPr>
         <w:pStyle w:val="Heading1"/>
+        <w:pageBreakBefore/>
         <w:rPr/>
       </w:pPr>
       <w:bookmarkStart w:id="74" w:name="__RefHeading___Toc3681_984269736"/>
@@ -25567,13 +25523,11 @@
         <w:rPr/>
         <w:t xml:space="preserve"> A amostra é de conveniência, formada por familiares e amigos dos integrantes, o que tende a elevar as notas: 8 dos 12 participantes deram nota 5 em todos os itens. A avaliação foi feita sobre capturas das telas, sem tarefas executadas no aplicativo, e por isso mede a compreensão e a percepção da interface, e não a eficácia no uso — não há taxa de conclusão de tarefas nem tempo de execução. Por essas razões, as perguntas específicas e os comentários são a parte mais informativa da avaliação, e as médias devem ser lidas como indício de aceitação, não como medida de usabilidade da população.</w:t>
       </w:r>
-      <w:r>
-        <w:br w:type="page"/>
-      </w:r>
     </w:p>
     <w:p>
       <w:pPr>
         <w:pStyle w:val="Heading1"/>
+        <w:pageBreakBefore/>
         <w:rPr/>
       </w:pPr>
       <w:bookmarkStart w:id="92" w:name="__RefHeading___Toc3699_984269736"/>
@@ -27080,13 +27034,11 @@
         <w:rPr/>
         <w:t>repetir a avaliação de usabilidade com tarefas no aplicativo instalado, com moradores fora do círculo da equipe, e incluir um mapa na tela de detalhes, como sugerido pelos participantes.</w:t>
       </w:r>
-      <w:r>
-        <w:br w:type="page"/>
-      </w:r>
     </w:p>
     <w:p>
       <w:pPr>
         <w:pStyle w:val="Heading1"/>
+        <w:pageBreakBefore/>
         <w:rPr/>
       </w:pPr>
       <w:bookmarkStart w:id="100" w:name="__RefHeading___Toc3707_984269736"/>
@@ -28000,13 +27952,11 @@
         <w:rPr/>
         <w:t>, v. 90, art. 101690, 2021. DOI: 10.1016/j.compenvurbsys.2021.101690.</w:t>
       </w:r>
-      <w:r>
-        <w:br w:type="page"/>
-      </w:r>
     </w:p>
     <w:p>
       <w:pPr>
         <w:pStyle w:val="Heading1"/>
+        <w:pageBreakBefore/>
         <w:rPr/>
       </w:pPr>
       <w:bookmarkStart w:id="102" w:name="__RefHeading___Toc3709_984269736"/>
@@ -28039,13 +27989,11 @@
         <w:rPr/>
         <w:t>Apêndice B – Questionário da avaliação de usabilidade</w:t>
       </w:r>
-      <w:r>
-        <w:br w:type="page"/>
-      </w:r>
     </w:p>
     <w:p>
       <w:pPr>
         <w:pStyle w:val="Heading2"/>
+        <w:pageBreakBefore/>
         <w:rPr/>
       </w:pPr>
       <w:bookmarkStart w:id="104" w:name="__RefHeading___Toc3711_984269736"/>
@@ -30530,13 +30478,11 @@
         <w:rPr/>
         <w:t>Fonte: elaborada pelos autores (2026). Passos, dados, resultados obtidos e evidências de cada caso estão na planilha do plano, no repositório.</w:t>
       </w:r>
-      <w:r>
-        <w:br w:type="page"/>
-      </w:r>
     </w:p>
     <w:p>
       <w:pPr>
         <w:pStyle w:val="Heading2"/>
+        <w:pageBreakBefore/>
         <w:rPr/>
       </w:pPr>
       <w:bookmarkStart w:id="106" w:name="__RefHeading___Toc3713_984269736"/>

</xml_diff>